<commit_message>
add simulation results. readme and doc cleanup
</commit_message>
<xml_diff>
--- a/freertos_master_slave/DESIGN.docx
+++ b/freertos_master_slave/DESIGN.docx
@@ -15094,6 +15094,106 @@
         <w:rPr>
           <w:rtl w:val="0"/>
         </w:rPr>
+      </w:r>
+    </w:p>
+    <w:p>
+      <w:pPr>
+        <w:pStyle w:val="Heading1"/>
+      </w:pPr>
+      <w:r>
+        <w:t>Potential Improvements and Extensions</w:t>
+      </w:r>
+    </w:p>
+    <w:p>
+      <w:pPr/>
+      <w:r>
+        <w:t>The following extensions could be made to the simulation to increase its realism, portability, or observability. Each is independent and can be implemented without restructuring the existing codebase.</w:t>
+      </w:r>
+    </w:p>
+    <w:p/>
+    <w:p>
+      <w:pPr>
+        <w:ind w:left="360"/>
+      </w:pPr>
+      <w:r>
+        <w:t xml:space="preserve">•  </w:t>
+      </w:r>
+      <w:r>
+        <w:rPr>
+          <w:b/>
+        </w:rPr>
+        <w:t xml:space="preserve">Additional devices — </w:t>
+      </w:r>
+      <w:r>
+        <w:t>The queue-based IPC architecture scales naturally to more devices. Adding a Device C requires only a new task, a new queue pair, and entries in ipc.h — no changes to existing device code are needed.</w:t>
+      </w:r>
+    </w:p>
+    <w:p>
+      <w:pPr>
+        <w:ind w:left="360"/>
+      </w:pPr>
+      <w:r>
+        <w:t xml:space="preserve">•  </w:t>
+      </w:r>
+      <w:r>
+        <w:rPr>
+          <w:b/>
+        </w:rPr>
+        <w:t xml:space="preserve">Real hardware target — </w:t>
+      </w:r>
+      <w:r>
+        <w:t>The application is portable to bare-metal FreeRTOS targets (e.g. STM32 Cortex-M). Swap the POSIX/Win32 simulator port for the Cortex-M port, replace heap_3 (which wraps system malloc) with heap_4 for deterministic allocation, and update FreeRTOSConfig.h for the target clock and interrupt controller. Application code and state-machine logic require no changes.</w:t>
+      </w:r>
+    </w:p>
+    <w:p>
+      <w:pPr>
+        <w:ind w:left="360"/>
+      </w:pPr>
+      <w:r>
+        <w:t xml:space="preserve">•  </w:t>
+      </w:r>
+      <w:r>
+        <w:rPr>
+          <w:b/>
+        </w:rPr>
+        <w:t xml:space="preserve">Persistent logging — </w:t>
+      </w:r>
+      <w:r>
+        <w:t>The logger task currently writes to stdout. Redirecting its output to a file descriptor or a ring buffer would allow post-run analysis and replay without modifying the device tasks.</w:t>
+      </w:r>
+    </w:p>
+    <w:p>
+      <w:pPr>
+        <w:ind w:left="360"/>
+      </w:pPr>
+      <w:r>
+        <w:t xml:space="preserve">•  </w:t>
+      </w:r>
+      <w:r>
+        <w:rPr>
+          <w:b/>
+        </w:rPr>
+        <w:t xml:space="preserve">Runtime fault injection — </w:t>
+      </w:r>
+      <w:r>
+        <w:t>A signal handler (SIGUSR1) or a dedicated CLI command could force Device B into FAULT on demand. This would enable targeted testing of the fault-detection and recovery paths without waiting on the pseudo-random number generator.</w:t>
+      </w:r>
+    </w:p>
+    <w:p>
+      <w:pPr>
+        <w:ind w:left="360"/>
+      </w:pPr>
+      <w:r>
+        <w:t xml:space="preserve">•  </w:t>
+      </w:r>
+      <w:r>
+        <w:rPr>
+          <w:b/>
+        </w:rPr>
+        <w:t xml:space="preserve">Software watchdog — </w:t>
+      </w:r>
+      <w:r>
+        <w:t>A watchdog task could monitor that each device task produces at least one queue message within a configurable timeout. A missed heartbeat would indicate task starvation or stack corruption and could trigger a controlled shutdown.</w:t>
       </w:r>
     </w:p>
     <w:sectPr>

</xml_diff>